<commit_message>
five rows of the tracker that were telling the wrong story
The roadmap shipped with all 48 tasks marked "Not started". At least four were
not, which is how a 23-day plan starts by rebuilding things that already work:
the fail-closed guard, the deletion workflow and the out-of-band alerting were
all substantially built before the document was written.

T00 verified, T01 and T03 deployed, T02 and T09 in progress. Strict against the
definitions in section 7 rather than generous: T02 asks for automated *and*
manual concurrent tests and the manual half has never been run, and T09 wants
one confirmed real deletion, which nobody has performed. Both have their code
written and tested, which is exactly what "In progress" is for.

The narrative record is Order 27 in PROGRESS.md and docs/ARCHITECTURE_TRUTH.md.
Those are diffable and this is not, so if the two ever disagree, they win.

Co-Authored-By: Claude Opus 5 (1M context) <noreply@anthropic.com>
</commit_message>
<xml_diff>
--- a/TED_Cumulative_Product_Optimization_Roadmap_v2.docx
+++ b/TED_Cumulative_Product_Optimization_Roadmap_v2.docx
@@ -6635,7 +6635,7 @@
               <w:rPr>
                 <w:sz w:val="14"/>
               </w:rPr>
-              <w:t>Not started</w:t>
+              <w:t>Verified</w:t>
             </w:r>
           </w:p>
         </w:tc>
@@ -6803,7 +6803,7 @@
               <w:rPr>
                 <w:sz w:val="14"/>
               </w:rPr>
-              <w:t>Not started</w:t>
+              <w:t>Deployed</w:t>
             </w:r>
           </w:p>
         </w:tc>
@@ -6971,7 +6971,7 @@
               <w:rPr>
                 <w:sz w:val="14"/>
               </w:rPr>
-              <w:t>Not started</w:t>
+              <w:t>In progress</w:t>
             </w:r>
           </w:p>
         </w:tc>
@@ -7139,7 +7139,7 @@
               <w:rPr>
                 <w:sz w:val="14"/>
               </w:rPr>
-              <w:t>Not started</w:t>
+              <w:t>Deployed</w:t>
             </w:r>
           </w:p>
         </w:tc>
@@ -8147,7 +8147,7 @@
               <w:rPr>
                 <w:sz w:val="14"/>
               </w:rPr>
-              <w:t>Not started</w:t>
+              <w:t>In progress</w:t>
             </w:r>
           </w:p>
         </w:tc>

</xml_diff>